<commit_message>
final code of Disaster Information updated
</commit_message>
<xml_diff>
--- a/Online Disaster Information Management System.docx
+++ b/Online Disaster Information Management System.docx
@@ -80,8 +80,6 @@
         </w:rPr>
         <w:t>Project Domain / Category</w:t>
       </w:r>
-      <w:bookmarkStart w:id="1" w:name="_GoBack"/>
-      <w:bookmarkEnd w:id="1"/>
     </w:p>
     <w:p>
       <w:pPr>
@@ -689,34 +687,7 @@
           <w:sz w:val="28"/>
           <w:szCs w:val="28"/>
         </w:rPr>
-        <w:t xml:space="preserve"> Institutes </w:t>
-      </w:r>
-      <w:r>
-        <w:rPr>
-          <w:rFonts w:asciiTheme="minorHAnsi" w:hAnsiTheme="minorHAnsi"/>
-          <w:bCs/>
-          <w:sz w:val="28"/>
-          <w:szCs w:val="28"/>
-        </w:rPr>
-        <w:t xml:space="preserve"> , </w:t>
-      </w:r>
-      <w:r>
-        <w:rPr>
-          <w:rFonts w:asciiTheme="minorHAnsi" w:hAnsiTheme="minorHAnsi"/>
-          <w:bCs/>
-          <w:sz w:val="28"/>
-          <w:szCs w:val="28"/>
-        </w:rPr>
-        <w:t>General User</w:t>
-      </w:r>
-      <w:r>
-        <w:rPr>
-          <w:rFonts w:asciiTheme="minorHAnsi" w:hAnsiTheme="minorHAnsi"/>
-          <w:bCs/>
-          <w:sz w:val="28"/>
-          <w:szCs w:val="28"/>
-        </w:rPr>
-        <w:t xml:space="preserve"> ) </w:t>
+        <w:t xml:space="preserve"> Institutes  , General User ) </w:t>
       </w:r>
     </w:p>
     <w:p>
@@ -922,6 +893,56 @@
         </w:rPr>
         <w:t>website.</w:t>
       </w:r>
+      <w:r>
+        <w:rPr>
+          <w:rFonts w:cstheme="minorHAnsi"/>
+          <w:sz w:val="28"/>
+          <w:szCs w:val="28"/>
+          <w:highlight w:val="yellow"/>
+          <w:lang w:val="en-US"/>
+        </w:rPr>
+        <w:t xml:space="preserve"> </w:t>
+      </w:r>
+      <w:r>
+        <w:rPr>
+          <w:rFonts w:cstheme="minorHAnsi"/>
+          <w:sz w:val="28"/>
+          <w:szCs w:val="28"/>
+          <w:highlight w:val="yellow"/>
+          <w:lang w:val="en-US"/>
+        </w:rPr>
+        <w:sym w:font="Wingdings" w:char="F0E0"/>
+      </w:r>
+      <w:r>
+        <w:rPr>
+          <w:rFonts w:cstheme="minorHAnsi"/>
+          <w:sz w:val="28"/>
+          <w:szCs w:val="28"/>
+          <w:highlight w:val="yellow"/>
+          <w:lang w:val="en-US"/>
+        </w:rPr>
+        <w:t xml:space="preserve"> approve </w:t>
+      </w:r>
+      <w:r>
+        <w:rPr>
+          <w:rFonts w:cstheme="minorHAnsi"/>
+          <w:sz w:val="28"/>
+          <w:szCs w:val="28"/>
+          <w:highlight w:val="yellow"/>
+          <w:lang w:val="en-US"/>
+        </w:rPr>
+        <w:sym w:font="Wingdings" w:char="F0E0"/>
+      </w:r>
+      <w:r>
+        <w:rPr>
+          <w:rFonts w:cstheme="minorHAnsi"/>
+          <w:sz w:val="28"/>
+          <w:szCs w:val="28"/>
+          <w:highlight w:val="yellow"/>
+          <w:lang w:val="en-US"/>
+        </w:rPr>
+        <w:t xml:space="preserve"> pending </w:t>
+      </w:r>
     </w:p>
     <w:p>
       <w:pPr>
@@ -1072,17 +1093,7 @@
           <w:highlight w:val="yellow"/>
           <w:lang w:val="en-US"/>
         </w:rPr>
-        <w:t xml:space="preserve"> </w:t>
-      </w:r>
-      <w:r>
-        <w:rPr>
-          <w:rFonts w:cstheme="minorHAnsi"/>
-          <w:sz w:val="28"/>
-          <w:szCs w:val="28"/>
-          <w:highlight w:val="yellow"/>
-          <w:lang w:val="en-US"/>
-        </w:rPr>
-        <w:t xml:space="preserve">Add </w:t>
+        <w:t xml:space="preserve"> Add </w:t>
       </w:r>
       <w:r>
         <w:rPr>
@@ -1292,6 +1303,16 @@
         </w:rPr>
         <w:t xml:space="preserve"> delete</w:t>
       </w:r>
+      <w:r>
+        <w:rPr>
+          <w:rFonts w:cstheme="minorHAnsi"/>
+          <w:sz w:val="28"/>
+          <w:szCs w:val="28"/>
+          <w:highlight w:val="yellow"/>
+          <w:lang w:val="en-US"/>
+        </w:rPr>
+        <w:t xml:space="preserve">      1. Request for reliefs </w:t>
+      </w:r>
     </w:p>
     <w:p>
       <w:pPr>
@@ -1397,6 +1418,8 @@
         </w:rPr>
         <w:t xml:space="preserve"> delete</w:t>
       </w:r>
+      <w:bookmarkStart w:id="1" w:name="_GoBack"/>
+      <w:bookmarkEnd w:id="1"/>
     </w:p>
     <w:p>
       <w:pPr>
@@ -2272,6 +2295,7 @@
     <w:lsdException w:name="HTML Sample" w:semiHidden="1" w:unhideWhenUsed="1"/>
     <w:lsdException w:name="HTML Typewriter" w:semiHidden="1" w:unhideWhenUsed="1"/>
     <w:lsdException w:name="HTML Variable" w:semiHidden="1" w:unhideWhenUsed="1"/>
+    <w:lsdException w:name="Normal Table" w:semiHidden="1" w:unhideWhenUsed="1"/>
     <w:lsdException w:name="annotation subject" w:semiHidden="1" w:unhideWhenUsed="1"/>
     <w:lsdException w:name="No List" w:semiHidden="1" w:unhideWhenUsed="1"/>
     <w:lsdException w:name="Outline List 1" w:semiHidden="1" w:unhideWhenUsed="1"/>
@@ -2315,8 +2339,10 @@
     <w:lsdException w:name="Table Elegant" w:semiHidden="1" w:unhideWhenUsed="1"/>
     <w:lsdException w:name="Table Professional" w:semiHidden="1" w:unhideWhenUsed="1"/>
     <w:lsdException w:name="Table Subtle 1" w:semiHidden="1" w:unhideWhenUsed="1"/>
+    <w:lsdException w:name="Table Subtle 2" w:semiHidden="1" w:unhideWhenUsed="1"/>
     <w:lsdException w:name="Table Web 1" w:semiHidden="1" w:unhideWhenUsed="1"/>
     <w:lsdException w:name="Table Web 2" w:semiHidden="1" w:unhideWhenUsed="1"/>
+    <w:lsdException w:name="Table Web 3" w:semiHidden="1" w:unhideWhenUsed="1"/>
     <w:lsdException w:name="Balloon Text" w:semiHidden="1" w:unhideWhenUsed="1"/>
     <w:lsdException w:name="Table Grid" w:uiPriority="39"/>
     <w:lsdException w:name="Table Theme" w:semiHidden="1" w:unhideWhenUsed="1"/>

</xml_diff>